<commit_message>
Add .gitignore to exclude temporary and report files
</commit_message>
<xml_diff>
--- a/Name.docx
+++ b/Name.docx
@@ -5,13 +5,13 @@
     <w:p>
       <w:pPr>
         <w:rPr>
-          <w:rFonts w:hint="default"/>
-          <w:lang w:val="fr-FR"/>
-        </w:rPr>
-      </w:pPr>
-      <w:r>
-        <w:rPr>
-          <w:rFonts w:hint="default"/>
+          <w:rFonts w:hint="default" w:ascii="Arial" w:hAnsi="Arial" w:cs="Arial"/>
+          <w:lang w:val="fr-FR"/>
+        </w:rPr>
+      </w:pPr>
+      <w:r>
+        <w:rPr>
+          <w:rFonts w:hint="default" w:ascii="Arial" w:hAnsi="Arial" w:cs="Arial"/>
           <w:lang w:val="fr-FR"/>
         </w:rPr>
         <w:t>Name : RAZAFINDRAIBE Hery Jhonny</w:t>
@@ -20,13 +20,13 @@
     <w:p>
       <w:pPr>
         <w:rPr>
-          <w:rFonts w:hint="default"/>
-          <w:lang w:val="fr-FR"/>
-        </w:rPr>
-      </w:pPr>
-      <w:r>
-        <w:rPr>
-          <w:rFonts w:hint="default"/>
+          <w:rFonts w:hint="default" w:ascii="Arial" w:hAnsi="Arial" w:cs="Arial"/>
+          <w:lang w:val="fr-FR"/>
+        </w:rPr>
+      </w:pPr>
+      <w:r>
+        <w:rPr>
+          <w:rFonts w:hint="default" w:ascii="Arial" w:hAnsi="Arial" w:cs="Arial"/>
           <w:lang w:val="fr-FR"/>
         </w:rPr>
         <w:t>GCYS 3 - ENSAT OF TANGIER</w:t>
@@ -38,13 +38,13 @@
           <w:bottom w:val="single" w:color="auto" w:sz="4" w:space="0"/>
         </w:pBdr>
         <w:rPr>
-          <w:rFonts w:hint="default"/>
-          <w:lang w:val="fr-FR"/>
-        </w:rPr>
-      </w:pPr>
-      <w:r>
-        <w:rPr>
-          <w:rFonts w:hint="default"/>
+          <w:rFonts w:hint="default" w:ascii="Arial" w:hAnsi="Arial" w:cs="Arial"/>
+          <w:lang w:val="fr-FR"/>
+        </w:rPr>
+      </w:pPr>
+      <w:r>
+        <w:rPr>
+          <w:rFonts w:hint="default" w:ascii="Arial" w:hAnsi="Arial" w:cs="Arial"/>
           <w:lang w:val="fr-FR"/>
         </w:rPr>
         <w:t>LAB1 of DEVOPS</w:t>
@@ -54,7 +54,7 @@
       <w:pPr>
         <w:jc w:val="center"/>
         <w:rPr>
-          <w:rFonts w:hint="default"/>
+          <w:rFonts w:hint="default" w:ascii="Arial" w:hAnsi="Arial" w:cs="Arial"/>
           <w:sz w:val="28"/>
           <w:szCs w:val="28"/>
           <w:u w:val="single"/>
@@ -63,7 +63,7 @@
       </w:pPr>
       <w:r>
         <w:rPr>
-          <w:rFonts w:hint="default"/>
+          <w:rFonts w:hint="default" w:ascii="Arial" w:hAnsi="Arial" w:cs="Arial"/>
           <w:sz w:val="28"/>
           <w:szCs w:val="28"/>
           <w:u w:val="single"/>
@@ -74,15 +74,1510 @@
     </w:p>
     <w:p>
       <w:pPr>
+        <w:keepNext w:val="0"/>
+        <w:keepLines w:val="0"/>
+        <w:widowControl/>
+        <w:numPr>
+          <w:ilvl w:val="0"/>
+          <w:numId w:val="1"/>
+        </w:numPr>
+        <w:suppressLineNumbers w:val="0"/>
+        <w:jc w:val="left"/>
+        <w:rPr>
+          <w:rFonts w:hint="default" w:ascii="Arial" w:hAnsi="Arial" w:cs="Arial"/>
+          <w:b/>
+          <w:bCs/>
+          <w:lang w:val="fr-FR"/>
+        </w:rPr>
+      </w:pPr>
+      <w:r>
+        <w:rPr>
+          <w:rFonts w:hint="default" w:ascii="Arial" w:hAnsi="Arial" w:cs="Arial"/>
+          <w:b/>
+          <w:bCs/>
+          <w:sz w:val="22"/>
+          <w:szCs w:val="22"/>
+          <w:lang w:val="fr-FR"/>
+        </w:rPr>
+        <w:t xml:space="preserve">Create a </w:t>
+      </w:r>
+      <w:r>
+        <w:rPr>
+          <w:rFonts w:hint="default" w:ascii="Arial" w:hAnsi="Arial" w:eastAsia="SimSun" w:cs="Arial"/>
+          <w:b/>
+          <w:bCs/>
+          <w:color w:val="000000"/>
+          <w:kern w:val="0"/>
+          <w:sz w:val="22"/>
+          <w:szCs w:val="22"/>
+          <w:lang w:val="en-US" w:eastAsia="zh-CN" w:bidi="ar"/>
+        </w:rPr>
+        <w:t>a simple Python API that performs basic arithmetic operations:</w:t>
+      </w:r>
+    </w:p>
+    <w:p>
+      <w:pPr>
+        <w:jc w:val="both"/>
+        <w:rPr>
+          <w:rFonts w:hint="default" w:ascii="Arial" w:hAnsi="Arial" w:cs="Arial"/>
+        </w:rPr>
+      </w:pPr>
+      <w:r>
+        <w:rPr>
+          <w:rFonts w:hint="default" w:ascii="Arial" w:hAnsi="Arial" w:cs="Arial"/>
+        </w:rPr>
+        <w:drawing>
+          <wp:inline distT="0" distB="0" distL="114300" distR="114300">
+            <wp:extent cx="5267325" cy="4532630"/>
+            <wp:effectExtent l="0" t="0" r="5715" b="8890"/>
+            <wp:docPr id="1" name="Image 1"/>
+            <wp:cNvGraphicFramePr>
+              <a:graphicFrameLocks xmlns:a="http://schemas.openxmlformats.org/drawingml/2006/main" noChangeAspect="1"/>
+            </wp:cNvGraphicFramePr>
+            <a:graphic xmlns:a="http://schemas.openxmlformats.org/drawingml/2006/main">
+              <a:graphicData uri="http://schemas.openxmlformats.org/drawingml/2006/picture">
+                <pic:pic xmlns:pic="http://schemas.openxmlformats.org/drawingml/2006/picture">
+                  <pic:nvPicPr>
+                    <pic:cNvPr id="1" name="Image 1"/>
+                    <pic:cNvPicPr>
+                      <a:picLocks noChangeAspect="1"/>
+                    </pic:cNvPicPr>
+                  </pic:nvPicPr>
+                  <pic:blipFill>
+                    <a:blip r:embed="rId4"/>
+                    <a:stretch>
+                      <a:fillRect/>
+                    </a:stretch>
+                  </pic:blipFill>
+                  <pic:spPr>
+                    <a:xfrm>
+                      <a:off x="0" y="0"/>
+                      <a:ext cx="5267325" cy="4532630"/>
+                    </a:xfrm>
+                    <a:prstGeom prst="rect">
+                      <a:avLst/>
+                    </a:prstGeom>
+                    <a:noFill/>
+                    <a:ln>
+                      <a:noFill/>
+                    </a:ln>
+                  </pic:spPr>
+                </pic:pic>
+              </a:graphicData>
+            </a:graphic>
+          </wp:inline>
+        </w:drawing>
+      </w:r>
+    </w:p>
+    <w:p>
+      <w:pPr>
+        <w:jc w:val="both"/>
+        <w:rPr>
+          <w:rFonts w:hint="default" w:ascii="Arial" w:hAnsi="Arial" w:cs="Arial"/>
+          <w:lang w:val="fr-FR"/>
+        </w:rPr>
+      </w:pPr>
+    </w:p>
+    <w:p>
+      <w:pPr>
+        <w:numPr>
+          <w:ilvl w:val="0"/>
+          <w:numId w:val="1"/>
+        </w:numPr>
+        <w:ind w:left="0" w:leftChars="0" w:firstLine="0" w:firstLineChars="0"/>
+        <w:jc w:val="both"/>
+        <w:rPr>
+          <w:rFonts w:hint="default" w:ascii="Arial" w:hAnsi="Arial" w:cs="Arial"/>
+          <w:b/>
+          <w:bCs/>
+          <w:lang w:val="fr-FR"/>
+        </w:rPr>
+      </w:pPr>
+      <w:r>
+        <w:rPr>
+          <w:rFonts w:hint="default" w:ascii="Arial" w:hAnsi="Arial" w:cs="Arial"/>
+          <w:b/>
+          <w:bCs/>
+          <w:lang w:val="fr-FR"/>
+        </w:rPr>
+        <w:t>Shell Script that monitor changes in the codes, rebuild the docker images and deploy updated docker image :</w:t>
+      </w:r>
+    </w:p>
+    <w:p>
+      <w:pPr>
+        <w:numPr>
+          <w:numId w:val="0"/>
+        </w:numPr>
+        <w:ind w:leftChars="0"/>
+        <w:jc w:val="both"/>
+        <w:rPr>
+          <w:rFonts w:hint="default" w:ascii="Arial" w:hAnsi="Arial" w:cs="Arial"/>
+        </w:rPr>
+      </w:pPr>
+      <w:r>
+        <w:rPr>
+          <w:rFonts w:hint="default" w:ascii="Arial" w:hAnsi="Arial" w:cs="Arial"/>
+        </w:rPr>
+        <w:drawing>
+          <wp:inline distT="0" distB="0" distL="114300" distR="114300">
+            <wp:extent cx="5271770" cy="2411730"/>
+            <wp:effectExtent l="0" t="0" r="1270" b="11430"/>
+            <wp:docPr id="2" name="Image 2"/>
+            <wp:cNvGraphicFramePr>
+              <a:graphicFrameLocks xmlns:a="http://schemas.openxmlformats.org/drawingml/2006/main" noChangeAspect="1"/>
+            </wp:cNvGraphicFramePr>
+            <a:graphic xmlns:a="http://schemas.openxmlformats.org/drawingml/2006/main">
+              <a:graphicData uri="http://schemas.openxmlformats.org/drawingml/2006/picture">
+                <pic:pic xmlns:pic="http://schemas.openxmlformats.org/drawingml/2006/picture">
+                  <pic:nvPicPr>
+                    <pic:cNvPr id="2" name="Image 2"/>
+                    <pic:cNvPicPr>
+                      <a:picLocks noChangeAspect="1"/>
+                    </pic:cNvPicPr>
+                  </pic:nvPicPr>
+                  <pic:blipFill>
+                    <a:blip r:embed="rId5"/>
+                    <a:stretch>
+                      <a:fillRect/>
+                    </a:stretch>
+                  </pic:blipFill>
+                  <pic:spPr>
+                    <a:xfrm>
+                      <a:off x="0" y="0"/>
+                      <a:ext cx="5271770" cy="2411730"/>
+                    </a:xfrm>
+                    <a:prstGeom prst="rect">
+                      <a:avLst/>
+                    </a:prstGeom>
+                    <a:noFill/>
+                    <a:ln>
+                      <a:noFill/>
+                    </a:ln>
+                  </pic:spPr>
+                </pic:pic>
+              </a:graphicData>
+            </a:graphic>
+          </wp:inline>
+        </w:drawing>
+      </w:r>
+    </w:p>
+    <w:p>
+      <w:pPr>
+        <w:pStyle w:val="5"/>
+        <w:keepNext w:val="0"/>
+        <w:keepLines w:val="0"/>
+        <w:widowControl/>
+        <w:suppressLineNumbers w:val="0"/>
+        <w:jc w:val="both"/>
+        <w:rPr>
+          <w:rFonts w:hint="default" w:ascii="Arial" w:hAnsi="Arial" w:cs="Arial"/>
+        </w:rPr>
+      </w:pPr>
+      <w:r>
+        <w:rPr>
+          <w:rFonts w:hint="default" w:ascii="Arial" w:hAnsi="Arial" w:cs="Arial"/>
+          <w:b/>
+          <w:bCs/>
+          <w:lang w:val="fr-FR"/>
+        </w:rPr>
+        <w:t>Explanation :</w:t>
+      </w:r>
+      <w:r>
+        <w:rPr>
+          <w:rFonts w:hint="default" w:ascii="Arial" w:hAnsi="Arial" w:cs="Arial"/>
+          <w:lang w:val="fr-FR"/>
+        </w:rPr>
+        <w:t xml:space="preserve"> </w:t>
+      </w:r>
+      <w:r>
+        <w:rPr>
+          <w:rFonts w:hint="default" w:ascii="Arial" w:hAnsi="Arial" w:cs="Arial"/>
+        </w:rPr>
+        <w:t>This Bash script automatically keeps an eye on a file called</w:t>
+      </w:r>
+      <w:r>
+        <w:rPr>
+          <w:rFonts w:hint="default" w:ascii="Arial" w:hAnsi="Arial" w:cs="Arial"/>
+          <w:b/>
+          <w:bCs/>
+        </w:rPr>
+        <w:t xml:space="preserve"> </w:t>
+      </w:r>
+      <w:r>
+        <w:rPr>
+          <w:rStyle w:val="4"/>
+          <w:rFonts w:hint="default" w:ascii="Arial" w:hAnsi="Arial" w:cs="Arial"/>
+          <w:b/>
+          <w:bCs/>
+          <w:sz w:val="24"/>
+          <w:szCs w:val="24"/>
+        </w:rPr>
+        <w:t>app.py</w:t>
+      </w:r>
+      <w:r>
+        <w:rPr>
+          <w:rFonts w:hint="default" w:ascii="Arial" w:hAnsi="Arial" w:cs="Arial"/>
+          <w:sz w:val="24"/>
+          <w:szCs w:val="24"/>
+        </w:rPr>
+        <w:t>.</w:t>
+      </w:r>
+      <w:r>
+        <w:rPr>
+          <w:rFonts w:hint="default" w:ascii="Arial" w:hAnsi="Arial" w:cs="Arial"/>
+        </w:rPr>
+        <w:t xml:space="preserve"> Every few seconds, it checks if the file has been changed by comparing its digital fingerprint (an MD5 hash). If it notices any updates, the script instantly rebuilds the </w:t>
+      </w:r>
+      <w:r>
+        <w:rPr>
+          <w:rFonts w:hint="default" w:ascii="Arial" w:hAnsi="Arial" w:cs="Arial"/>
+          <w:b/>
+          <w:bCs/>
+        </w:rPr>
+        <w:t>Docker image</w:t>
+      </w:r>
+      <w:r>
+        <w:rPr>
+          <w:rFonts w:hint="default" w:ascii="Arial" w:hAnsi="Arial" w:cs="Arial"/>
+        </w:rPr>
+        <w:t xml:space="preserve">, </w:t>
+      </w:r>
+      <w:r>
+        <w:rPr>
+          <w:rFonts w:hint="default" w:ascii="Arial" w:hAnsi="Arial" w:cs="Arial"/>
+          <w:b/>
+          <w:bCs/>
+        </w:rPr>
+        <w:t>stops the old container</w:t>
+      </w:r>
+      <w:r>
+        <w:rPr>
+          <w:rFonts w:hint="default" w:ascii="Arial" w:hAnsi="Arial" w:cs="Arial"/>
+        </w:rPr>
+        <w:t xml:space="preserve">, and </w:t>
+      </w:r>
+      <w:r>
+        <w:rPr>
+          <w:rFonts w:hint="default" w:ascii="Arial" w:hAnsi="Arial" w:cs="Arial"/>
+          <w:b/>
+          <w:bCs/>
+        </w:rPr>
+        <w:t>launches a new one with the latest version of the app</w:t>
+      </w:r>
+      <w:r>
+        <w:rPr>
+          <w:rFonts w:hint="default" w:ascii="Arial" w:hAnsi="Arial" w:cs="Arial"/>
+        </w:rPr>
+        <w:t>.</w:t>
+      </w:r>
+    </w:p>
+    <w:p>
+      <w:pPr>
+        <w:pStyle w:val="5"/>
+        <w:keepNext w:val="0"/>
+        <w:keepLines w:val="0"/>
+        <w:widowControl/>
+        <w:numPr>
+          <w:ilvl w:val="0"/>
+          <w:numId w:val="2"/>
+        </w:numPr>
+        <w:suppressLineNumbers w:val="0"/>
+        <w:jc w:val="both"/>
+        <w:rPr>
+          <w:rFonts w:hint="default" w:ascii="Arial" w:hAnsi="Arial" w:cs="Arial"/>
+          <w:b/>
+          <w:bCs/>
+          <w:lang w:val="fr-FR"/>
+        </w:rPr>
+      </w:pPr>
+      <w:r>
+        <w:rPr>
+          <w:rFonts w:hint="default" w:ascii="Arial" w:hAnsi="Arial" w:cs="Arial"/>
+          <w:b/>
+          <w:bCs/>
+          <w:lang w:val="fr-FR"/>
+        </w:rPr>
+        <w:t xml:space="preserve"> Git repository:</w:t>
+      </w:r>
+    </w:p>
+    <w:p>
+      <w:pPr>
+        <w:pStyle w:val="5"/>
+        <w:keepNext w:val="0"/>
+        <w:keepLines w:val="0"/>
+        <w:widowControl/>
+        <w:numPr>
+          <w:numId w:val="0"/>
+        </w:numPr>
+        <w:suppressLineNumbers w:val="0"/>
+        <w:ind w:right="0" w:rightChars="0"/>
+        <w:jc w:val="left"/>
+        <w:rPr>
+          <w:rFonts w:hint="default" w:ascii="Arial" w:hAnsi="Arial" w:cs="Arial"/>
+          <w:lang w:val="fr-FR"/>
+        </w:rPr>
+      </w:pPr>
+      <w:r>
+        <w:rPr>
+          <w:rFonts w:hint="default" w:ascii="Arial" w:hAnsi="Arial" w:cs="Arial"/>
+          <w:lang w:val="fr-FR"/>
+        </w:rPr>
+        <w:t xml:space="preserve">This is the link of my Repository : </w:t>
+      </w:r>
+      <w:r>
+        <w:rPr>
+          <w:rFonts w:hint="default" w:ascii="Arial" w:hAnsi="Arial" w:cs="Arial"/>
+          <w:lang w:val="fr-FR"/>
+        </w:rPr>
+        <w:fldChar w:fldCharType="begin"/>
+      </w:r>
+      <w:r>
+        <w:rPr>
+          <w:rFonts w:hint="default" w:ascii="Arial" w:hAnsi="Arial" w:cs="Arial"/>
+          <w:lang w:val="fr-FR"/>
+        </w:rPr>
+        <w:instrText xml:space="preserve"> HYPERLINK "https://github.com/CiscoZeroDay/arithmetic_api_devops" </w:instrText>
+      </w:r>
+      <w:r>
+        <w:rPr>
+          <w:rFonts w:hint="default" w:ascii="Arial" w:hAnsi="Arial" w:cs="Arial"/>
+          <w:lang w:val="fr-FR"/>
+        </w:rPr>
+        <w:fldChar w:fldCharType="separate"/>
+      </w:r>
+      <w:r>
+        <w:rPr>
+          <w:rStyle w:val="3"/>
+          <w:rFonts w:hint="default" w:ascii="Arial" w:hAnsi="Arial" w:cs="Arial"/>
+          <w:lang w:val="fr-FR"/>
+        </w:rPr>
+        <w:t>https://github.com/CiscoZeroDay/arithmetic_api_devops</w:t>
+      </w:r>
+      <w:r>
+        <w:rPr>
+          <w:rFonts w:hint="default" w:ascii="Arial" w:hAnsi="Arial" w:cs="Arial"/>
+          <w:lang w:val="fr-FR"/>
+        </w:rPr>
+        <w:fldChar w:fldCharType="end"/>
+      </w:r>
+      <w:r>
+        <w:rPr>
+          <w:rFonts w:hint="default" w:ascii="Arial" w:hAnsi="Arial" w:cs="Arial"/>
+          <w:lang w:val="fr-FR"/>
+        </w:rPr>
+        <w:t xml:space="preserve"> </w:t>
+      </w:r>
+    </w:p>
+    <w:p>
+      <w:pPr>
+        <w:pStyle w:val="5"/>
+        <w:keepNext w:val="0"/>
+        <w:keepLines w:val="0"/>
+        <w:widowControl/>
+        <w:numPr>
+          <w:ilvl w:val="0"/>
+          <w:numId w:val="2"/>
+        </w:numPr>
+        <w:suppressLineNumbers w:val="0"/>
+        <w:ind w:left="0" w:leftChars="0" w:right="0" w:rightChars="0" w:firstLine="0" w:firstLineChars="0"/>
+        <w:jc w:val="left"/>
+        <w:rPr>
+          <w:rFonts w:hint="default" w:ascii="Arial" w:hAnsi="Arial" w:cs="Arial"/>
+          <w:lang w:val="fr-FR"/>
+        </w:rPr>
+      </w:pPr>
+      <w:r>
+        <w:rPr>
+          <w:rFonts w:hint="default" w:ascii="Arial" w:hAnsi="Arial" w:cs="Arial"/>
+          <w:b/>
+          <w:bCs/>
+          <w:lang w:val="fr-FR"/>
+        </w:rPr>
+        <w:t xml:space="preserve"> Monitor git repository</w:t>
+      </w:r>
+      <w:r>
+        <w:rPr>
+          <w:rFonts w:hint="default" w:ascii="Arial" w:hAnsi="Arial" w:cs="Arial"/>
+          <w:lang w:val="fr-FR"/>
+        </w:rPr>
+        <w:t xml:space="preserve"> (check for new commits..)</w:t>
+      </w:r>
+    </w:p>
+    <w:p>
+      <w:pPr>
+        <w:pStyle w:val="5"/>
+        <w:keepNext w:val="0"/>
+        <w:keepLines w:val="0"/>
+        <w:widowControl/>
+        <w:numPr>
+          <w:numId w:val="0"/>
+        </w:numPr>
+        <w:suppressLineNumbers w:val="0"/>
+        <w:ind w:leftChars="0" w:right="0" w:rightChars="0"/>
+        <w:jc w:val="left"/>
+        <w:rPr>
+          <w:rFonts w:hint="default" w:ascii="Arial" w:hAnsi="Arial" w:cs="Arial"/>
+          <w:lang w:val="fr-FR"/>
+        </w:rPr>
+      </w:pPr>
+      <w:r>
+        <w:rPr>
+          <w:rFonts w:hint="default" w:ascii="Arial" w:hAnsi="Arial" w:cs="Arial"/>
+          <w:lang w:val="fr-FR"/>
+        </w:rPr>
+        <w:t>For this i created a new shell file named «git_watch_and_deploy.sh»</w:t>
+      </w:r>
+    </w:p>
+    <w:p>
+      <w:pPr>
+        <w:pStyle w:val="5"/>
+        <w:keepNext w:val="0"/>
+        <w:keepLines w:val="0"/>
+        <w:widowControl/>
+        <w:numPr>
+          <w:numId w:val="0"/>
+        </w:numPr>
+        <w:suppressLineNumbers w:val="0"/>
+        <w:ind w:leftChars="0" w:right="0" w:rightChars="0"/>
+        <w:jc w:val="left"/>
+        <w:rPr>
+          <w:rFonts w:hint="default" w:ascii="Arial" w:hAnsi="Arial" w:cs="Arial"/>
+          <w:lang w:val="fr-FR"/>
+        </w:rPr>
+      </w:pPr>
+      <w:r>
+        <w:rPr>
+          <w:rFonts w:hint="default" w:ascii="Arial" w:hAnsi="Arial" w:cs="Arial"/>
+        </w:rPr>
+        <w:drawing>
+          <wp:inline distT="0" distB="0" distL="114300" distR="114300">
+            <wp:extent cx="5272405" cy="3338830"/>
+            <wp:effectExtent l="0" t="0" r="635" b="13970"/>
+            <wp:docPr id="3" name="Image 3"/>
+            <wp:cNvGraphicFramePr>
+              <a:graphicFrameLocks xmlns:a="http://schemas.openxmlformats.org/drawingml/2006/main" noChangeAspect="1"/>
+            </wp:cNvGraphicFramePr>
+            <a:graphic xmlns:a="http://schemas.openxmlformats.org/drawingml/2006/main">
+              <a:graphicData uri="http://schemas.openxmlformats.org/drawingml/2006/picture">
+                <pic:pic xmlns:pic="http://schemas.openxmlformats.org/drawingml/2006/picture">
+                  <pic:nvPicPr>
+                    <pic:cNvPr id="3" name="Image 3"/>
+                    <pic:cNvPicPr>
+                      <a:picLocks noChangeAspect="1"/>
+                    </pic:cNvPicPr>
+                  </pic:nvPicPr>
+                  <pic:blipFill>
+                    <a:blip r:embed="rId6"/>
+                    <a:stretch>
+                      <a:fillRect/>
+                    </a:stretch>
+                  </pic:blipFill>
+                  <pic:spPr>
+                    <a:xfrm>
+                      <a:off x="0" y="0"/>
+                      <a:ext cx="5272405" cy="3338830"/>
+                    </a:xfrm>
+                    <a:prstGeom prst="rect">
+                      <a:avLst/>
+                    </a:prstGeom>
+                    <a:noFill/>
+                    <a:ln>
+                      <a:noFill/>
+                    </a:ln>
+                  </pic:spPr>
+                </pic:pic>
+              </a:graphicData>
+            </a:graphic>
+          </wp:inline>
+        </w:drawing>
+      </w:r>
+    </w:p>
+    <w:p>
+      <w:pPr>
+        <w:numPr>
+          <w:numId w:val="0"/>
+        </w:numPr>
+        <w:ind w:leftChars="0"/>
+        <w:jc w:val="both"/>
+        <w:rPr>
+          <w:rFonts w:hint="default" w:ascii="Arial" w:hAnsi="Arial" w:eastAsia="SimSun" w:cs="Arial"/>
+          <w:sz w:val="24"/>
+          <w:szCs w:val="24"/>
+        </w:rPr>
+      </w:pPr>
+      <w:r>
+        <w:rPr>
+          <w:rFonts w:hint="default" w:ascii="Arial" w:hAnsi="Arial" w:cs="Arial"/>
+          <w:lang w:val="fr-FR"/>
+        </w:rPr>
+        <w:t xml:space="preserve">Explanation : </w:t>
+      </w:r>
+      <w:r>
+        <w:rPr>
+          <w:rFonts w:hint="default" w:ascii="Arial" w:hAnsi="Arial" w:eastAsia="SimSun" w:cs="Arial"/>
+          <w:sz w:val="24"/>
+          <w:szCs w:val="24"/>
+        </w:rPr>
+        <w:t>This Bash script automatically monitors a Git repository for new commits. Every few seconds, it checks if the remote branch (</w:t>
+      </w:r>
+      <w:r>
+        <w:rPr>
+          <w:rStyle w:val="4"/>
+          <w:rFonts w:hint="default" w:ascii="Arial" w:hAnsi="Arial" w:eastAsia="SimSun" w:cs="Arial"/>
+          <w:sz w:val="24"/>
+          <w:szCs w:val="24"/>
+        </w:rPr>
+        <w:t>origin/main</w:t>
+      </w:r>
+      <w:r>
+        <w:rPr>
+          <w:rFonts w:hint="default" w:ascii="Arial" w:hAnsi="Arial" w:eastAsia="SimSun" w:cs="Arial"/>
+          <w:sz w:val="24"/>
+          <w:szCs w:val="24"/>
+        </w:rPr>
+        <w:t>) has been updated. When a new commit is detected, the script pulls the latest changes, rebuilds the Docker image, stops and removes the old container, and then runs a new one with the updated code.</w:t>
+      </w:r>
+    </w:p>
+    <w:p>
+      <w:pPr>
+        <w:numPr>
+          <w:numId w:val="0"/>
+        </w:numPr>
+        <w:ind w:leftChars="0"/>
+        <w:jc w:val="both"/>
+        <w:rPr>
+          <w:rFonts w:hint="default" w:ascii="Arial" w:hAnsi="Arial" w:eastAsia="SimSun" w:cs="Arial"/>
+          <w:sz w:val="24"/>
+          <w:szCs w:val="24"/>
+        </w:rPr>
+      </w:pPr>
+    </w:p>
+    <w:p>
+      <w:pPr>
+        <w:numPr>
+          <w:ilvl w:val="0"/>
+          <w:numId w:val="2"/>
+        </w:numPr>
+        <w:ind w:left="0" w:leftChars="0" w:firstLine="0" w:firstLineChars="0"/>
+        <w:jc w:val="both"/>
+        <w:rPr>
+          <w:rFonts w:hint="default" w:ascii="Arial" w:hAnsi="Arial" w:eastAsia="SimSun" w:cs="Arial"/>
+          <w:b/>
+          <w:bCs/>
+          <w:sz w:val="24"/>
+          <w:szCs w:val="24"/>
+          <w:lang w:val="fr-FR"/>
+        </w:rPr>
+      </w:pPr>
+      <w:r>
+        <w:rPr>
+          <w:rFonts w:hint="default" w:ascii="Arial" w:hAnsi="Arial" w:eastAsia="SimSun" w:cs="Arial"/>
+          <w:b/>
+          <w:bCs/>
+          <w:sz w:val="24"/>
+          <w:szCs w:val="24"/>
+          <w:lang w:val="fr-FR"/>
+        </w:rPr>
+        <w:t>Test and Validation</w:t>
+      </w:r>
+    </w:p>
+    <w:p>
+      <w:pPr>
+        <w:numPr>
+          <w:numId w:val="0"/>
+        </w:numPr>
+        <w:ind w:leftChars="0"/>
+        <w:jc w:val="both"/>
+        <w:rPr>
+          <w:rFonts w:hint="default" w:ascii="Arial" w:hAnsi="Arial" w:eastAsia="SimSun" w:cs="Arial"/>
+          <w:sz w:val="24"/>
+          <w:szCs w:val="24"/>
+          <w:lang w:val="fr-FR"/>
+        </w:rPr>
+      </w:pPr>
+    </w:p>
+    <w:p>
+      <w:pPr>
+        <w:numPr>
+          <w:numId w:val="0"/>
+        </w:numPr>
+        <w:ind w:leftChars="0" w:firstLine="708" w:firstLineChars="0"/>
+        <w:jc w:val="both"/>
+        <w:rPr>
+          <w:rFonts w:hint="default" w:ascii="Arial" w:hAnsi="Arial" w:eastAsia="SimSun" w:cs="Arial"/>
+          <w:sz w:val="24"/>
+          <w:szCs w:val="24"/>
+          <w:lang w:val="fr-FR"/>
+        </w:rPr>
+      </w:pPr>
+      <w:r>
+        <w:rPr>
+          <w:rFonts w:hint="default" w:ascii="Arial" w:hAnsi="Arial" w:eastAsia="SimSun" w:cs="Arial"/>
+          <w:sz w:val="24"/>
+          <w:szCs w:val="24"/>
+          <w:lang w:val="fr-FR"/>
+        </w:rPr>
+        <w:t>5-a Run the shell code</w:t>
+      </w:r>
+    </w:p>
+    <w:p>
+      <w:pPr>
+        <w:numPr>
+          <w:numId w:val="0"/>
+        </w:numPr>
+        <w:ind w:leftChars="0" w:firstLine="708" w:firstLineChars="0"/>
+        <w:jc w:val="both"/>
+        <w:rPr>
+          <w:rFonts w:hint="default" w:ascii="Arial" w:hAnsi="Arial" w:eastAsia="SimSun" w:cs="Arial"/>
+          <w:sz w:val="24"/>
+          <w:szCs w:val="24"/>
+          <w:lang w:val="fr-FR"/>
+        </w:rPr>
+      </w:pPr>
+      <w:r>
+        <w:rPr>
+          <w:rFonts w:hint="default" w:ascii="Arial" w:hAnsi="Arial" w:eastAsia="SimSun" w:cs="Arial"/>
+          <w:sz w:val="24"/>
+          <w:szCs w:val="24"/>
+          <w:lang w:val="fr-FR"/>
+        </w:rPr>
+        <w:drawing>
+          <wp:inline distT="0" distB="0" distL="114300" distR="114300">
+            <wp:extent cx="5273040" cy="383540"/>
+            <wp:effectExtent l="0" t="0" r="0" b="12700"/>
+            <wp:docPr id="5" name="Image 5" descr="Capture d'écran 2025-10-18 145619"/>
+            <wp:cNvGraphicFramePr>
+              <a:graphicFrameLocks xmlns:a="http://schemas.openxmlformats.org/drawingml/2006/main" noChangeAspect="1"/>
+            </wp:cNvGraphicFramePr>
+            <a:graphic xmlns:a="http://schemas.openxmlformats.org/drawingml/2006/main">
+              <a:graphicData uri="http://schemas.openxmlformats.org/drawingml/2006/picture">
+                <pic:pic xmlns:pic="http://schemas.openxmlformats.org/drawingml/2006/picture">
+                  <pic:nvPicPr>
+                    <pic:cNvPr id="5" name="Image 5" descr="Capture d'écran 2025-10-18 145619"/>
+                    <pic:cNvPicPr>
+                      <a:picLocks noChangeAspect="1"/>
+                    </pic:cNvPicPr>
+                  </pic:nvPicPr>
+                  <pic:blipFill>
+                    <a:blip r:embed="rId7"/>
+                    <a:stretch>
+                      <a:fillRect/>
+                    </a:stretch>
+                  </pic:blipFill>
+                  <pic:spPr>
+                    <a:xfrm>
+                      <a:off x="0" y="0"/>
+                      <a:ext cx="5273040" cy="383540"/>
+                    </a:xfrm>
+                    <a:prstGeom prst="rect">
+                      <a:avLst/>
+                    </a:prstGeom>
+                  </pic:spPr>
+                </pic:pic>
+              </a:graphicData>
+            </a:graphic>
+          </wp:inline>
+        </w:drawing>
+      </w:r>
+      <w:r>
+        <w:rPr>
+          <w:rFonts w:hint="default" w:ascii="Arial" w:hAnsi="Arial" w:eastAsia="SimSun" w:cs="Arial"/>
+          <w:sz w:val="24"/>
+          <w:szCs w:val="24"/>
+          <w:lang w:val="fr-FR"/>
+        </w:rPr>
+        <w:drawing>
+          <wp:inline distT="0" distB="0" distL="114300" distR="114300">
+            <wp:extent cx="5274310" cy="382905"/>
+            <wp:effectExtent l="0" t="0" r="13970" b="13335"/>
+            <wp:docPr id="4" name="Image 4" descr="Capture d'écran 2025-10-18 145611"/>
+            <wp:cNvGraphicFramePr>
+              <a:graphicFrameLocks xmlns:a="http://schemas.openxmlformats.org/drawingml/2006/main" noChangeAspect="1"/>
+            </wp:cNvGraphicFramePr>
+            <a:graphic xmlns:a="http://schemas.openxmlformats.org/drawingml/2006/main">
+              <a:graphicData uri="http://schemas.openxmlformats.org/drawingml/2006/picture">
+                <pic:pic xmlns:pic="http://schemas.openxmlformats.org/drawingml/2006/picture">
+                  <pic:nvPicPr>
+                    <pic:cNvPr id="4" name="Image 4" descr="Capture d'écran 2025-10-18 145611"/>
+                    <pic:cNvPicPr>
+                      <a:picLocks noChangeAspect="1"/>
+                    </pic:cNvPicPr>
+                  </pic:nvPicPr>
+                  <pic:blipFill>
+                    <a:blip r:embed="rId8"/>
+                    <a:stretch>
+                      <a:fillRect/>
+                    </a:stretch>
+                  </pic:blipFill>
+                  <pic:spPr>
+                    <a:xfrm>
+                      <a:off x="0" y="0"/>
+                      <a:ext cx="5274310" cy="382905"/>
+                    </a:xfrm>
+                    <a:prstGeom prst="rect">
+                      <a:avLst/>
+                    </a:prstGeom>
+                  </pic:spPr>
+                </pic:pic>
+              </a:graphicData>
+            </a:graphic>
+          </wp:inline>
+        </w:drawing>
+      </w:r>
+    </w:p>
+    <w:p>
+      <w:pPr>
+        <w:numPr>
+          <w:numId w:val="0"/>
+        </w:numPr>
+        <w:ind w:leftChars="0" w:firstLine="708" w:firstLineChars="0"/>
+        <w:jc w:val="both"/>
+        <w:rPr>
+          <w:rFonts w:hint="default" w:ascii="Arial" w:hAnsi="Arial" w:eastAsia="SimSun" w:cs="Arial"/>
+          <w:sz w:val="24"/>
+          <w:szCs w:val="24"/>
+          <w:lang w:val="fr-FR"/>
+        </w:rPr>
+      </w:pPr>
+    </w:p>
+    <w:p>
+      <w:pPr>
+        <w:numPr>
+          <w:numId w:val="0"/>
+        </w:numPr>
+        <w:ind w:leftChars="0" w:firstLine="708" w:firstLineChars="0"/>
+        <w:jc w:val="both"/>
+        <w:rPr>
+          <w:rFonts w:hint="default" w:ascii="Arial" w:hAnsi="Arial" w:eastAsia="SimSun" w:cs="Arial"/>
+          <w:i/>
+          <w:iCs/>
+          <w:sz w:val="24"/>
+          <w:szCs w:val="24"/>
+          <w:lang w:val="fr-FR"/>
+        </w:rPr>
+      </w:pPr>
+      <w:r>
+        <w:rPr>
+          <w:rFonts w:hint="default" w:ascii="Arial" w:hAnsi="Arial" w:eastAsia="SimSun" w:cs="Arial"/>
+          <w:sz w:val="24"/>
+          <w:szCs w:val="24"/>
+          <w:lang w:val="fr-FR"/>
+        </w:rPr>
+        <w:t xml:space="preserve">5-b I modify «app.py» : </w:t>
+      </w:r>
+      <w:r>
+        <w:rPr>
+          <w:rFonts w:hint="default" w:ascii="Arial" w:hAnsi="Arial" w:eastAsia="SimSun" w:cs="Arial"/>
+          <w:i/>
+          <w:iCs/>
+          <w:sz w:val="24"/>
+          <w:szCs w:val="24"/>
+          <w:lang w:val="fr-FR"/>
+        </w:rPr>
+        <w:t xml:space="preserve">change the debug mode to </w:t>
+      </w:r>
+      <w:r>
+        <w:rPr>
+          <w:rFonts w:hint="default" w:ascii="Arial" w:hAnsi="Arial" w:eastAsia="SimSun" w:cs="Arial"/>
+          <w:b/>
+          <w:bCs/>
+          <w:i/>
+          <w:iCs/>
+          <w:sz w:val="24"/>
+          <w:szCs w:val="24"/>
+          <w:lang w:val="fr-FR"/>
+        </w:rPr>
+        <w:t>false</w:t>
+      </w:r>
+    </w:p>
+    <w:p>
+      <w:pPr>
+        <w:numPr>
+          <w:numId w:val="0"/>
+        </w:numPr>
+        <w:jc w:val="both"/>
+        <w:rPr>
+          <w:rFonts w:hint="default" w:ascii="Arial" w:hAnsi="Arial" w:eastAsia="SimSun" w:cs="Arial"/>
+          <w:sz w:val="24"/>
+          <w:szCs w:val="24"/>
+          <w:lang w:val="fr-FR"/>
+        </w:rPr>
+      </w:pPr>
+      <w:r>
+        <w:rPr>
+          <w:rFonts w:hint="default" w:ascii="Arial" w:hAnsi="Arial" w:eastAsia="SimSun" w:cs="Arial"/>
+          <w:sz w:val="24"/>
+          <w:szCs w:val="24"/>
+          <w:lang w:val="fr-FR"/>
+        </w:rPr>
+        <w:drawing>
+          <wp:inline distT="0" distB="0" distL="114300" distR="114300">
+            <wp:extent cx="5200650" cy="619125"/>
+            <wp:effectExtent l="0" t="0" r="11430" b="5715"/>
+            <wp:docPr id="7" name="Image 7" descr="Capture d'écran 2025-10-18 145753"/>
+            <wp:cNvGraphicFramePr>
+              <a:graphicFrameLocks xmlns:a="http://schemas.openxmlformats.org/drawingml/2006/main" noChangeAspect="1"/>
+            </wp:cNvGraphicFramePr>
+            <a:graphic xmlns:a="http://schemas.openxmlformats.org/drawingml/2006/main">
+              <a:graphicData uri="http://schemas.openxmlformats.org/drawingml/2006/picture">
+                <pic:pic xmlns:pic="http://schemas.openxmlformats.org/drawingml/2006/picture">
+                  <pic:nvPicPr>
+                    <pic:cNvPr id="7" name="Image 7" descr="Capture d'écran 2025-10-18 145753"/>
+                    <pic:cNvPicPr>
+                      <a:picLocks noChangeAspect="1"/>
+                    </pic:cNvPicPr>
+                  </pic:nvPicPr>
+                  <pic:blipFill>
+                    <a:blip r:embed="rId9"/>
+                    <a:stretch>
+                      <a:fillRect/>
+                    </a:stretch>
+                  </pic:blipFill>
+                  <pic:spPr>
+                    <a:xfrm>
+                      <a:off x="0" y="0"/>
+                      <a:ext cx="5200650" cy="619125"/>
+                    </a:xfrm>
+                    <a:prstGeom prst="rect">
+                      <a:avLst/>
+                    </a:prstGeom>
+                  </pic:spPr>
+                </pic:pic>
+              </a:graphicData>
+            </a:graphic>
+          </wp:inline>
+        </w:drawing>
+      </w:r>
+      <w:r>
+        <w:rPr>
+          <w:rFonts w:hint="default" w:ascii="Arial" w:hAnsi="Arial" w:eastAsia="SimSun" w:cs="Arial"/>
+          <w:sz w:val="24"/>
+          <w:szCs w:val="24"/>
+          <w:lang w:val="fr-FR"/>
+        </w:rPr>
+        <w:drawing>
+          <wp:inline distT="0" distB="0" distL="114300" distR="114300">
+            <wp:extent cx="4800600" cy="466725"/>
+            <wp:effectExtent l="0" t="0" r="0" b="5715"/>
+            <wp:docPr id="6" name="Image 6" descr="Capture d'écran 2025-10-18 145804"/>
+            <wp:cNvGraphicFramePr>
+              <a:graphicFrameLocks xmlns:a="http://schemas.openxmlformats.org/drawingml/2006/main" noChangeAspect="1"/>
+            </wp:cNvGraphicFramePr>
+            <a:graphic xmlns:a="http://schemas.openxmlformats.org/drawingml/2006/main">
+              <a:graphicData uri="http://schemas.openxmlformats.org/drawingml/2006/picture">
+                <pic:pic xmlns:pic="http://schemas.openxmlformats.org/drawingml/2006/picture">
+                  <pic:nvPicPr>
+                    <pic:cNvPr id="6" name="Image 6" descr="Capture d'écran 2025-10-18 145804"/>
+                    <pic:cNvPicPr>
+                      <a:picLocks noChangeAspect="1"/>
+                    </pic:cNvPicPr>
+                  </pic:nvPicPr>
+                  <pic:blipFill>
+                    <a:blip r:embed="rId10"/>
+                    <a:stretch>
+                      <a:fillRect/>
+                    </a:stretch>
+                  </pic:blipFill>
+                  <pic:spPr>
+                    <a:xfrm>
+                      <a:off x="0" y="0"/>
+                      <a:ext cx="4800600" cy="466725"/>
+                    </a:xfrm>
+                    <a:prstGeom prst="rect">
+                      <a:avLst/>
+                    </a:prstGeom>
+                  </pic:spPr>
+                </pic:pic>
+              </a:graphicData>
+            </a:graphic>
+          </wp:inline>
+        </w:drawing>
+      </w:r>
+    </w:p>
+    <w:p>
+      <w:pPr>
+        <w:numPr>
+          <w:numId w:val="0"/>
+        </w:numPr>
+        <w:ind w:leftChars="0" w:firstLine="708" w:firstLineChars="0"/>
+        <w:jc w:val="both"/>
+        <w:rPr>
+          <w:rFonts w:hint="default" w:ascii="Arial" w:hAnsi="Arial" w:eastAsia="SimSun" w:cs="Arial"/>
+          <w:sz w:val="24"/>
+          <w:szCs w:val="24"/>
+          <w:lang w:val="fr-FR"/>
+        </w:rPr>
+      </w:pPr>
+      <w:r>
+        <w:rPr>
+          <w:rFonts w:hint="default" w:ascii="Arial" w:hAnsi="Arial" w:eastAsia="SimSun" w:cs="Arial"/>
+          <w:sz w:val="24"/>
+          <w:szCs w:val="24"/>
+          <w:lang w:val="fr-FR"/>
+        </w:rPr>
+        <w:t>5-c Result :</w:t>
+      </w:r>
+    </w:p>
+    <w:p>
+      <w:pPr>
+        <w:numPr>
+          <w:numId w:val="0"/>
+        </w:numPr>
+        <w:jc w:val="both"/>
+        <w:rPr>
+          <w:rFonts w:hint="default" w:ascii="Arial" w:hAnsi="Arial" w:eastAsia="SimSun" w:cs="Arial"/>
+          <w:b/>
+          <w:bCs/>
+          <w:sz w:val="24"/>
+          <w:szCs w:val="24"/>
+          <w:lang w:val="fr-FR"/>
+        </w:rPr>
+      </w:pPr>
+      <w:r>
+        <w:drawing>
+          <wp:inline distT="0" distB="0" distL="114300" distR="114300">
+            <wp:extent cx="5269865" cy="4215765"/>
+            <wp:effectExtent l="0" t="0" r="3175" b="5715"/>
+            <wp:docPr id="8" name="Image 4"/>
+            <wp:cNvGraphicFramePr>
+              <a:graphicFrameLocks xmlns:a="http://schemas.openxmlformats.org/drawingml/2006/main" noChangeAspect="1"/>
+            </wp:cNvGraphicFramePr>
+            <a:graphic xmlns:a="http://schemas.openxmlformats.org/drawingml/2006/main">
+              <a:graphicData uri="http://schemas.openxmlformats.org/drawingml/2006/picture">
+                <pic:pic xmlns:pic="http://schemas.openxmlformats.org/drawingml/2006/picture">
+                  <pic:nvPicPr>
+                    <pic:cNvPr id="8" name="Image 4"/>
+                    <pic:cNvPicPr>
+                      <a:picLocks noChangeAspect="1"/>
+                    </pic:cNvPicPr>
+                  </pic:nvPicPr>
+                  <pic:blipFill>
+                    <a:blip r:embed="rId11"/>
+                    <a:stretch>
+                      <a:fillRect/>
+                    </a:stretch>
+                  </pic:blipFill>
+                  <pic:spPr>
+                    <a:xfrm>
+                      <a:off x="0" y="0"/>
+                      <a:ext cx="5269865" cy="4215765"/>
+                    </a:xfrm>
+                    <a:prstGeom prst="rect">
+                      <a:avLst/>
+                    </a:prstGeom>
+                    <a:noFill/>
+                    <a:ln>
+                      <a:noFill/>
+                    </a:ln>
+                  </pic:spPr>
+                </pic:pic>
+              </a:graphicData>
+            </a:graphic>
+          </wp:inline>
+        </w:drawing>
+      </w:r>
+    </w:p>
+    <w:p>
+      <w:pPr>
+        <w:numPr>
+          <w:numId w:val="0"/>
+        </w:numPr>
+        <w:ind w:leftChars="0"/>
+        <w:jc w:val="both"/>
+        <w:rPr>
+          <w:rFonts w:hint="default" w:ascii="Arial" w:hAnsi="Arial" w:eastAsia="SimSun" w:cs="Arial"/>
+          <w:b/>
+          <w:bCs/>
+          <w:sz w:val="24"/>
+          <w:szCs w:val="24"/>
+          <w:lang w:val="fr-FR"/>
+        </w:rPr>
+      </w:pPr>
+      <w:r>
+        <w:rPr>
+          <w:rFonts w:hint="default" w:ascii="Arial" w:hAnsi="Arial" w:eastAsia="SimSun" w:cs="Arial"/>
+          <w:sz w:val="24"/>
+          <w:szCs w:val="24"/>
+          <w:lang w:val="fr-FR"/>
+        </w:rPr>
+        <w:t xml:space="preserve">It was detected and my docker image is </w:t>
+      </w:r>
+      <w:r>
+        <w:rPr>
+          <w:rFonts w:hint="default" w:ascii="Arial" w:hAnsi="Arial" w:eastAsia="SimSun" w:cs="Arial"/>
+          <w:b/>
+          <w:bCs/>
+          <w:sz w:val="24"/>
+          <w:szCs w:val="24"/>
+          <w:lang w:val="fr-FR"/>
+        </w:rPr>
+        <w:t>automatically updated.</w:t>
+      </w:r>
+    </w:p>
+    <w:p>
+      <w:pPr>
+        <w:numPr>
+          <w:numId w:val="0"/>
+        </w:numPr>
+        <w:ind w:leftChars="0"/>
+        <w:jc w:val="both"/>
+        <w:rPr>
+          <w:rFonts w:hint="default" w:ascii="Arial" w:hAnsi="Arial" w:eastAsia="SimSun" w:cs="Arial"/>
+          <w:b/>
+          <w:bCs/>
+          <w:sz w:val="24"/>
+          <w:szCs w:val="24"/>
+          <w:lang w:val="fr-FR"/>
+        </w:rPr>
+      </w:pPr>
+    </w:p>
+    <w:p>
+      <w:pPr>
+        <w:numPr>
+          <w:ilvl w:val="0"/>
+          <w:numId w:val="2"/>
+        </w:numPr>
+        <w:ind w:left="0" w:leftChars="0" w:firstLine="0" w:firstLineChars="0"/>
+        <w:jc w:val="both"/>
+        <w:rPr>
+          <w:rFonts w:hint="default" w:ascii="Arial" w:hAnsi="Arial" w:eastAsia="SimSun" w:cs="Arial"/>
+          <w:b/>
+          <w:bCs/>
+          <w:sz w:val="24"/>
+          <w:szCs w:val="24"/>
+          <w:lang w:val="fr-FR"/>
+        </w:rPr>
+      </w:pPr>
+      <w:r>
+        <w:rPr>
+          <w:rFonts w:hint="default" w:ascii="Arial" w:hAnsi="Arial" w:eastAsia="SimSun" w:cs="Arial"/>
+          <w:b/>
+          <w:bCs/>
+          <w:sz w:val="24"/>
+          <w:szCs w:val="24"/>
+          <w:lang w:val="fr-FR"/>
+        </w:rPr>
+        <w:t>Verify my Docker Destop:</w:t>
+      </w:r>
+    </w:p>
+    <w:p>
+      <w:pPr>
+        <w:numPr>
+          <w:numId w:val="0"/>
+        </w:numPr>
+        <w:ind w:left="120" w:leftChars="0" w:hanging="120" w:hangingChars="50"/>
+        <w:jc w:val="left"/>
+        <w:rPr>
+          <w:rFonts w:hint="default" w:ascii="Arial" w:hAnsi="Arial" w:eastAsia="SimSun" w:cs="Arial"/>
+          <w:b w:val="0"/>
+          <w:bCs w:val="0"/>
+          <w:sz w:val="24"/>
+          <w:szCs w:val="24"/>
+          <w:lang w:val="fr-FR"/>
+        </w:rPr>
+      </w:pPr>
+      <w:r>
+        <w:rPr>
+          <w:rFonts w:hint="default" w:ascii="Arial" w:hAnsi="Arial" w:eastAsia="SimSun" w:cs="Arial"/>
+          <w:b w:val="0"/>
+          <w:bCs w:val="0"/>
+          <w:sz w:val="24"/>
+          <w:szCs w:val="24"/>
+          <w:lang w:val="fr-FR"/>
+        </w:rPr>
+        <w:t>Docker Image :</w:t>
+      </w:r>
+    </w:p>
+    <w:p>
+      <w:pPr>
+        <w:numPr>
+          <w:numId w:val="0"/>
+        </w:numPr>
+        <w:ind w:left="120" w:leftChars="0" w:hanging="120" w:hangingChars="50"/>
+        <w:jc w:val="left"/>
+        <w:rPr>
+          <w:rFonts w:hint="default" w:ascii="Arial" w:hAnsi="Arial" w:eastAsia="SimSun" w:cs="Arial"/>
+          <w:b w:val="0"/>
+          <w:bCs w:val="0"/>
+          <w:sz w:val="24"/>
+          <w:szCs w:val="24"/>
+          <w:lang w:val="fr-FR"/>
+        </w:rPr>
+      </w:pPr>
+      <w:r>
+        <w:rPr>
+          <w:rFonts w:hint="default" w:ascii="Arial" w:hAnsi="Arial" w:eastAsia="SimSun" w:cs="Arial"/>
+          <w:b w:val="0"/>
+          <w:bCs w:val="0"/>
+          <w:sz w:val="24"/>
+          <w:szCs w:val="24"/>
+          <w:lang w:val="fr-FR"/>
+        </w:rPr>
+        <w:drawing>
+          <wp:inline distT="0" distB="0" distL="114300" distR="114300">
+            <wp:extent cx="5263515" cy="226695"/>
+            <wp:effectExtent l="0" t="0" r="9525" b="1905"/>
+            <wp:docPr id="11" name="Image 11" descr="Capture d'écran 2025-10-18 150258"/>
+            <wp:cNvGraphicFramePr>
+              <a:graphicFrameLocks xmlns:a="http://schemas.openxmlformats.org/drawingml/2006/main" noChangeAspect="1"/>
+            </wp:cNvGraphicFramePr>
+            <a:graphic xmlns:a="http://schemas.openxmlformats.org/drawingml/2006/main">
+              <a:graphicData uri="http://schemas.openxmlformats.org/drawingml/2006/picture">
+                <pic:pic xmlns:pic="http://schemas.openxmlformats.org/drawingml/2006/picture">
+                  <pic:nvPicPr>
+                    <pic:cNvPr id="11" name="Image 11" descr="Capture d'écran 2025-10-18 150258"/>
+                    <pic:cNvPicPr>
+                      <a:picLocks noChangeAspect="1"/>
+                    </pic:cNvPicPr>
+                  </pic:nvPicPr>
+                  <pic:blipFill>
+                    <a:blip r:embed="rId12"/>
+                    <a:stretch>
+                      <a:fillRect/>
+                    </a:stretch>
+                  </pic:blipFill>
+                  <pic:spPr>
+                    <a:xfrm>
+                      <a:off x="0" y="0"/>
+                      <a:ext cx="5263515" cy="226695"/>
+                    </a:xfrm>
+                    <a:prstGeom prst="rect">
+                      <a:avLst/>
+                    </a:prstGeom>
+                  </pic:spPr>
+                </pic:pic>
+              </a:graphicData>
+            </a:graphic>
+          </wp:inline>
+        </w:drawing>
+      </w:r>
+    </w:p>
+    <w:p>
+      <w:pPr>
+        <w:numPr>
+          <w:numId w:val="0"/>
+        </w:numPr>
+        <w:ind w:left="120" w:leftChars="0" w:hanging="120" w:hangingChars="50"/>
+        <w:jc w:val="left"/>
+        <w:rPr>
+          <w:rFonts w:hint="default" w:ascii="Arial" w:hAnsi="Arial" w:eastAsia="SimSun" w:cs="Arial"/>
+          <w:b w:val="0"/>
+          <w:bCs w:val="0"/>
+          <w:sz w:val="24"/>
+          <w:szCs w:val="24"/>
+          <w:lang w:val="fr-FR"/>
+        </w:rPr>
+      </w:pPr>
+      <w:r>
+        <w:rPr>
+          <w:rFonts w:hint="default" w:ascii="Arial" w:hAnsi="Arial" w:eastAsia="SimSun" w:cs="Arial"/>
+          <w:b w:val="0"/>
+          <w:bCs w:val="0"/>
+          <w:sz w:val="24"/>
+          <w:szCs w:val="24"/>
+          <w:lang w:val="fr-FR"/>
+        </w:rPr>
+        <w:t xml:space="preserve">Docker Container : </w:t>
+      </w:r>
+    </w:p>
+    <w:p>
+      <w:pPr>
+        <w:numPr>
+          <w:numId w:val="0"/>
+        </w:numPr>
+        <w:ind w:leftChars="0"/>
+        <w:jc w:val="both"/>
+        <w:rPr>
+          <w:rFonts w:hint="default" w:ascii="Arial" w:hAnsi="Arial" w:eastAsia="SimSun" w:cs="Arial"/>
+          <w:b w:val="0"/>
+          <w:bCs w:val="0"/>
+          <w:sz w:val="24"/>
+          <w:szCs w:val="24"/>
+          <w:lang w:val="fr-FR"/>
+        </w:rPr>
+      </w:pPr>
+      <w:r>
+        <w:rPr>
+          <w:rFonts w:hint="default" w:ascii="Arial" w:hAnsi="Arial" w:eastAsia="SimSun" w:cs="Arial"/>
+          <w:b w:val="0"/>
+          <w:bCs w:val="0"/>
+          <w:sz w:val="24"/>
+          <w:szCs w:val="24"/>
+          <w:lang w:val="fr-FR"/>
+        </w:rPr>
+        <w:drawing>
+          <wp:inline distT="0" distB="0" distL="114300" distR="114300">
+            <wp:extent cx="5269230" cy="247650"/>
+            <wp:effectExtent l="0" t="0" r="3810" b="11430"/>
+            <wp:docPr id="10" name="Image 10" descr="Capture d'écran 2025-10-18 150310"/>
+            <wp:cNvGraphicFramePr>
+              <a:graphicFrameLocks xmlns:a="http://schemas.openxmlformats.org/drawingml/2006/main" noChangeAspect="1"/>
+            </wp:cNvGraphicFramePr>
+            <a:graphic xmlns:a="http://schemas.openxmlformats.org/drawingml/2006/main">
+              <a:graphicData uri="http://schemas.openxmlformats.org/drawingml/2006/picture">
+                <pic:pic xmlns:pic="http://schemas.openxmlformats.org/drawingml/2006/picture">
+                  <pic:nvPicPr>
+                    <pic:cNvPr id="10" name="Image 10" descr="Capture d'écran 2025-10-18 150310"/>
+                    <pic:cNvPicPr>
+                      <a:picLocks noChangeAspect="1"/>
+                    </pic:cNvPicPr>
+                  </pic:nvPicPr>
+                  <pic:blipFill>
+                    <a:blip r:embed="rId13"/>
+                    <a:stretch>
+                      <a:fillRect/>
+                    </a:stretch>
+                  </pic:blipFill>
+                  <pic:spPr>
+                    <a:xfrm>
+                      <a:off x="0" y="0"/>
+                      <a:ext cx="5269230" cy="247650"/>
+                    </a:xfrm>
+                    <a:prstGeom prst="rect">
+                      <a:avLst/>
+                    </a:prstGeom>
+                  </pic:spPr>
+                </pic:pic>
+              </a:graphicData>
+            </a:graphic>
+          </wp:inline>
+        </w:drawing>
+      </w:r>
+    </w:p>
+    <w:p>
+      <w:pPr>
+        <w:numPr>
+          <w:ilvl w:val="0"/>
+          <w:numId w:val="2"/>
+        </w:numPr>
+        <w:ind w:left="0" w:leftChars="0" w:firstLine="0" w:firstLineChars="0"/>
+        <w:jc w:val="both"/>
+        <w:rPr>
+          <w:rFonts w:hint="default" w:ascii="Arial" w:hAnsi="Arial" w:eastAsia="SimSun" w:cs="Arial"/>
+          <w:b w:val="0"/>
+          <w:bCs w:val="0"/>
+          <w:sz w:val="24"/>
+          <w:szCs w:val="24"/>
+          <w:lang w:val="fr-FR"/>
+        </w:rPr>
+      </w:pPr>
+      <w:r>
+        <w:rPr>
+          <w:rFonts w:hint="default" w:ascii="Arial" w:hAnsi="Arial" w:eastAsia="SimSun" w:cs="Arial"/>
+          <w:b w:val="0"/>
+          <w:bCs w:val="0"/>
+          <w:sz w:val="24"/>
+          <w:szCs w:val="24"/>
+          <w:lang w:val="fr-FR"/>
+        </w:rPr>
+        <w:t xml:space="preserve"> Verify my GitHub repository :</w:t>
+      </w:r>
+    </w:p>
+    <w:p>
+      <w:pPr>
+        <w:numPr>
+          <w:numId w:val="0"/>
+        </w:numPr>
+        <w:ind w:leftChars="0"/>
+        <w:jc w:val="both"/>
+      </w:pPr>
+      <w:r>
+        <w:drawing>
+          <wp:inline distT="0" distB="0" distL="114300" distR="114300">
+            <wp:extent cx="5266690" cy="2267585"/>
+            <wp:effectExtent l="0" t="0" r="6350" b="3175"/>
+            <wp:docPr id="12" name="Image 5"/>
+            <wp:cNvGraphicFramePr>
+              <a:graphicFrameLocks xmlns:a="http://schemas.openxmlformats.org/drawingml/2006/main" noChangeAspect="1"/>
+            </wp:cNvGraphicFramePr>
+            <a:graphic xmlns:a="http://schemas.openxmlformats.org/drawingml/2006/main">
+              <a:graphicData uri="http://schemas.openxmlformats.org/drawingml/2006/picture">
+                <pic:pic xmlns:pic="http://schemas.openxmlformats.org/drawingml/2006/picture">
+                  <pic:nvPicPr>
+                    <pic:cNvPr id="12" name="Image 5"/>
+                    <pic:cNvPicPr>
+                      <a:picLocks noChangeAspect="1"/>
+                    </pic:cNvPicPr>
+                  </pic:nvPicPr>
+                  <pic:blipFill>
+                    <a:blip r:embed="rId14"/>
+                    <a:stretch>
+                      <a:fillRect/>
+                    </a:stretch>
+                  </pic:blipFill>
+                  <pic:spPr>
+                    <a:xfrm>
+                      <a:off x="0" y="0"/>
+                      <a:ext cx="5266690" cy="2267585"/>
+                    </a:xfrm>
+                    <a:prstGeom prst="rect">
+                      <a:avLst/>
+                    </a:prstGeom>
+                    <a:noFill/>
+                    <a:ln>
+                      <a:noFill/>
+                    </a:ln>
+                  </pic:spPr>
+                </pic:pic>
+              </a:graphicData>
+            </a:graphic>
+          </wp:inline>
+        </w:drawing>
+      </w:r>
+    </w:p>
+    <w:p>
+      <w:pPr>
+        <w:numPr>
+          <w:numId w:val="0"/>
+        </w:numPr>
+        <w:ind w:leftChars="0"/>
+        <w:jc w:val="both"/>
+      </w:pPr>
+    </w:p>
+    <w:p>
+      <w:pPr>
+        <w:numPr>
+          <w:ilvl w:val="0"/>
+          <w:numId w:val="2"/>
+        </w:numPr>
+        <w:ind w:left="0" w:leftChars="0" w:firstLine="0" w:firstLineChars="0"/>
         <w:jc w:val="both"/>
         <w:rPr>
           <w:rFonts w:hint="default"/>
-          <w:sz w:val="24"/>
-          <w:szCs w:val="24"/>
-          <w:u w:val="single"/>
-          <w:lang w:val="fr-FR"/>
-        </w:rPr>
-      </w:pPr>
+          <w:lang w:val="fr-FR"/>
+        </w:rPr>
+      </w:pPr>
+      <w:r>
+        <w:rPr>
+          <w:rFonts w:hint="default"/>
+          <w:lang w:val="fr-FR"/>
+        </w:rPr>
+        <w:t xml:space="preserve">Docker Hub link : </w:t>
+      </w:r>
+    </w:p>
+    <w:p>
+      <w:pPr>
+        <w:numPr>
+          <w:numId w:val="0"/>
+        </w:numPr>
+        <w:ind w:leftChars="0"/>
+        <w:jc w:val="both"/>
+      </w:pPr>
+      <w:r>
+        <w:drawing>
+          <wp:inline distT="0" distB="0" distL="114300" distR="114300">
+            <wp:extent cx="5273675" cy="1570355"/>
+            <wp:effectExtent l="0" t="0" r="14605" b="14605"/>
+            <wp:docPr id="13" name="Image 6"/>
+            <wp:cNvGraphicFramePr>
+              <a:graphicFrameLocks xmlns:a="http://schemas.openxmlformats.org/drawingml/2006/main" noChangeAspect="1"/>
+            </wp:cNvGraphicFramePr>
+            <a:graphic xmlns:a="http://schemas.openxmlformats.org/drawingml/2006/main">
+              <a:graphicData uri="http://schemas.openxmlformats.org/drawingml/2006/picture">
+                <pic:pic xmlns:pic="http://schemas.openxmlformats.org/drawingml/2006/picture">
+                  <pic:nvPicPr>
+                    <pic:cNvPr id="13" name="Image 6"/>
+                    <pic:cNvPicPr>
+                      <a:picLocks noChangeAspect="1"/>
+                    </pic:cNvPicPr>
+                  </pic:nvPicPr>
+                  <pic:blipFill>
+                    <a:blip r:embed="rId15"/>
+                    <a:stretch>
+                      <a:fillRect/>
+                    </a:stretch>
+                  </pic:blipFill>
+                  <pic:spPr>
+                    <a:xfrm>
+                      <a:off x="0" y="0"/>
+                      <a:ext cx="5273675" cy="1570355"/>
+                    </a:xfrm>
+                    <a:prstGeom prst="rect">
+                      <a:avLst/>
+                    </a:prstGeom>
+                    <a:noFill/>
+                    <a:ln>
+                      <a:noFill/>
+                    </a:ln>
+                  </pic:spPr>
+                </pic:pic>
+              </a:graphicData>
+            </a:graphic>
+          </wp:inline>
+        </w:drawing>
+      </w:r>
+    </w:p>
+    <w:p>
+      <w:pPr>
+        <w:numPr>
+          <w:numId w:val="0"/>
+        </w:numPr>
+        <w:ind w:leftChars="0"/>
+        <w:jc w:val="both"/>
+      </w:pPr>
+    </w:p>
+    <w:p>
+      <w:pPr>
+        <w:numPr>
+          <w:numId w:val="0"/>
+        </w:numPr>
+        <w:ind w:leftChars="0"/>
+        <w:jc w:val="both"/>
+        <w:rPr>
+          <w:rFonts w:hint="default"/>
+          <w:lang w:val="fr-FR"/>
+        </w:rPr>
+      </w:pPr>
+      <w:r>
+        <w:rPr>
+          <w:rFonts w:hint="default"/>
+          <w:lang w:val="fr-FR"/>
+        </w:rPr>
+        <w:t xml:space="preserve">Link : </w:t>
+      </w:r>
+      <w:r>
+        <w:rPr>
+          <w:rFonts w:hint="default"/>
+          <w:lang w:val="fr-FR"/>
+        </w:rPr>
+        <w:fldChar w:fldCharType="begin"/>
+      </w:r>
+      <w:r>
+        <w:rPr>
+          <w:rFonts w:hint="default"/>
+          <w:lang w:val="fr-FR"/>
+        </w:rPr>
+        <w:instrText xml:space="preserve"> HYPERLINK "https://hub.docker.com/repository/docker/razafindraibe/simple-api/general" </w:instrText>
+      </w:r>
+      <w:r>
+        <w:rPr>
+          <w:rFonts w:hint="default"/>
+          <w:lang w:val="fr-FR"/>
+        </w:rPr>
+        <w:fldChar w:fldCharType="separate"/>
+      </w:r>
+      <w:r>
+        <w:rPr>
+          <w:rStyle w:val="3"/>
+          <w:rFonts w:hint="default"/>
+          <w:lang w:val="fr-FR"/>
+        </w:rPr>
+        <w:t>https://hub.docker.com/repository/docker/razafindraibe/simple-api/general</w:t>
+      </w:r>
+      <w:r>
+        <w:rPr>
+          <w:rFonts w:hint="default"/>
+          <w:lang w:val="fr-FR"/>
+        </w:rPr>
+        <w:fldChar w:fldCharType="end"/>
+      </w:r>
+      <w:r>
+        <w:rPr>
+          <w:rFonts w:hint="default"/>
+          <w:lang w:val="fr-FR"/>
+        </w:rPr>
+        <w:t xml:space="preserve"> </w:t>
+      </w:r>
       <w:bookmarkStart w:id="0" w:name="_GoBack"/>
       <w:bookmarkEnd w:id="0"/>
     </w:p>
@@ -96,12 +1591,47 @@
 </w:document>
 </file>
 
+<file path=word/numbering.xml><?xml version="1.0" encoding="utf-8"?>
+<w:numbering xmlns:wpc="http://schemas.microsoft.com/office/word/2010/wordprocessingCanvas" xmlns:mc="http://schemas.openxmlformats.org/markup-compatibility/2006" xmlns:o="urn:schemas-microsoft-com:office:office" xmlns:r="http://schemas.openxmlformats.org/officeDocument/2006/relationships" xmlns:m="http://schemas.openxmlformats.org/officeDocument/2006/math" xmlns:v="urn:schemas-microsoft-com:vml" xmlns:wp14="http://schemas.microsoft.com/office/word/2010/wordprocessingDrawing" xmlns:wp="http://schemas.openxmlformats.org/drawingml/2006/wordprocessingDrawing" xmlns:w10="urn:schemas-microsoft-com:office:word" xmlns:w="http://schemas.openxmlformats.org/wordprocessingml/2006/main" xmlns:w14="http://schemas.microsoft.com/office/word/2010/wordml" xmlns:wpg="http://schemas.microsoft.com/office/word/2010/wordprocessingGroup" xmlns:wpi="http://schemas.microsoft.com/office/word/2010/wordprocessingInk" xmlns:wne="http://schemas.microsoft.com/office/word/2006/wordml" xmlns:wps="http://schemas.microsoft.com/office/word/2010/wordprocessingShape" xmlns:wpsCustomData="http://www.wps.cn/officeDocument/2013/wpsCustomData" mc:Ignorable="w14 wp14">
+  <w:abstractNum w:abstractNumId="0">
+    <w:nsid w:val="20F2DF02"/>
+    <w:multiLevelType w:val="singleLevel"/>
+    <w:tmpl w:val="20F2DF02"/>
+    <w:lvl w:ilvl="0" w:tentative="0">
+      <w:start w:val="3"/>
+      <w:numFmt w:val="decimal"/>
+      <w:suff w:val="nothing"/>
+      <w:lvlText w:val="%1-"/>
+      <w:lvlJc w:val="left"/>
+    </w:lvl>
+  </w:abstractNum>
+  <w:abstractNum w:abstractNumId="1">
+    <w:nsid w:val="2C09F21A"/>
+    <w:multiLevelType w:val="singleLevel"/>
+    <w:tmpl w:val="2C09F21A"/>
+    <w:lvl w:ilvl="0" w:tentative="0">
+      <w:start w:val="1"/>
+      <w:numFmt w:val="decimal"/>
+      <w:suff w:val="space"/>
+      <w:lvlText w:val="%1."/>
+      <w:lvlJc w:val="left"/>
+    </w:lvl>
+  </w:abstractNum>
+  <w:num w:numId="1">
+    <w:abstractNumId w:val="1"/>
+  </w:num>
+  <w:num w:numId="2">
+    <w:abstractNumId w:val="0"/>
+  </w:num>
+</w:numbering>
+</file>
+
 <file path=word/styles.xml><?xml version="1.0" encoding="utf-8"?>
 <w:styles xmlns:mc="http://schemas.openxmlformats.org/markup-compatibility/2006" xmlns:o="urn:schemas-microsoft-com:office:office" xmlns:r="http://schemas.openxmlformats.org/officeDocument/2006/relationships" xmlns:m="http://schemas.openxmlformats.org/officeDocument/2006/math" xmlns:v="urn:schemas-microsoft-com:vml" xmlns:w="http://schemas.openxmlformats.org/wordprocessingml/2006/main" xmlns:w14="http://schemas.microsoft.com/office/word/2010/wordml" xmlns:w10="urn:schemas-microsoft-com:office:word" xmlns:sl="http://schemas.openxmlformats.org/schemaLibrary/2006/main" xmlns:wpsCustomData="http://www.wps.cn/officeDocument/2013/wpsCustomData" mc:Ignorable="w14">
   <w:docDefaults>
     <w:rPrDefault>
       <w:rPr>
-        <w:rFonts w:asciiTheme="minorHAnsi" w:hAnsiTheme="minorHAnsi" w:eastAsiaTheme="minorEastAsia" w:cstheme="minorBidi"/>
+        <w:rFonts w:ascii="Times New Roman" w:hAnsi="Times New Roman" w:eastAsia="SimSun" w:cs="Times New Roman"/>
       </w:rPr>
     </w:rPrDefault>
     <w:pPrDefault/>
@@ -235,7 +1765,7 @@
     <w:semiHidden/>
     <w:uiPriority w:val="0"/>
   </w:style>
-  <w:style w:type="table" w:default="1" w:styleId="3">
+  <w:style w:type="table" w:default="1" w:styleId="6">
     <w:name w:val="Normal Table"/>
     <w:semiHidden/>
     <w:uiPriority w:val="0"/>
@@ -247,6 +1777,38 @@
         <w:right w:w="108" w:type="dxa"/>
       </w:tblCellMar>
     </w:tblPr>
+  </w:style>
+  <w:style w:type="character" w:styleId="3">
+    <w:name w:val="Hyperlink"/>
+    <w:uiPriority w:val="0"/>
+    <w:rPr>
+      <w:color w:val="0000FF"/>
+      <w:u w:val="single"/>
+    </w:rPr>
+  </w:style>
+  <w:style w:type="character" w:styleId="4">
+    <w:name w:val="HTML Code"/>
+    <w:uiPriority w:val="0"/>
+    <w:rPr>
+      <w:rFonts w:ascii="Courier New" w:hAnsi="Courier New" w:cs="Courier New"/>
+      <w:sz w:val="20"/>
+      <w:szCs w:val="20"/>
+    </w:rPr>
+  </w:style>
+  <w:style w:type="paragraph" w:styleId="5">
+    <w:name w:val="Normal (Web)"/>
+    <w:uiPriority w:val="0"/>
+    <w:pPr>
+      <w:spacing w:before="0" w:beforeAutospacing="1" w:after="0" w:afterAutospacing="1"/>
+      <w:ind w:left="0" w:right="0"/>
+      <w:jc w:val="left"/>
+    </w:pPr>
+    <w:rPr>
+      <w:kern w:val="0"/>
+      <w:sz w:val="24"/>
+      <w:szCs w:val="24"/>
+      <w:lang w:val="en-US" w:eastAsia="zh-CN" w:bidi="ar"/>
+    </w:rPr>
   </w:style>
 </w:styles>
 </file>

</xml_diff>